<commit_message>
focus web v0.1 on curated resources
</commit_message>
<xml_diff>
--- a/docs/product-concept-v0.2.docx
+++ b/docs/product-concept-v0.2.docx
@@ -136,7 +136,7 @@
           <w:i w:val="0"/>
           <w:color w:val="202124"/>
         </w:rPr>
-        <w:t>本产品不是面向所有人的开放 Skills 市场，也不是第一天就解决本地安装与多 Agent 管理。第一阶段只验证一件事：把 KOL 已经筛选和分享的 GitHub Skills 转化为中文内容站后，能否让粉丝更容易理解、尝试并完成一次有效使用。</w:t>
+        <w:t>本产品不是面向所有人的开放 Skills 市场，也不是第一天就解决本地安装与多 Agent 管理。第一阶段把 KOL 已经筛选和分享的 GitHub Skills 整合为中文 Web 资源库，验证粉丝能否更容易发现、理解、整理、尝试并完成一次有效使用。</w:t>
       </w:r>
     </w:p>
     <w:p>
@@ -164,7 +164,7 @@
           <w:color w:val="202124"/>
           <w:sz w:val="22"/>
         </w:rPr>
-        <w:t>Website First；先做人工策展验证版，不做完整平台；GitHub 作为事实来源；KOL 负责解释；用匿名反馈验证真实使用。</w:t>
+        <w:t>Website First；先做人工策展与资源整合，不扫描本机目录；GitHub 作为事实来源；KOL 负责解释；用本地资源状态和匿名反馈验证真实使用。</w:t>
       </w:r>
     </w:p>
     <w:p>
@@ -270,7 +270,7 @@
           <w:rFonts w:ascii="Arial Unicode MS" w:hAnsi="Arial Unicode MS" w:eastAsia="Arial Unicode MS"/>
           <w:color w:val="202124"/>
         </w:rPr>
-        <w:t>第一版做 Website，只解决发现、理解、尝试和低成本反馈。</w:t>
+        <w:t>第一版做 Website，解决发现、理解、收藏、手动标记想尝试或已使用，以及低成本反馈。</w:t>
       </w:r>
     </w:p>
     <w:p>
@@ -286,7 +286,7 @@
           <w:rFonts w:ascii="Arial Unicode MS" w:hAnsi="Arial Unicode MS" w:eastAsia="Arial Unicode MS"/>
           <w:color w:val="202124"/>
         </w:rPr>
-        <w:t>验证版不做账号和公开社区；反馈先采用匿名表单与一键结果回访。</w:t>
+        <w:t>验证版不做账号和公开社区；资源状态保存在浏览器，反馈先采用匿名表单与一键结果回访。</w:t>
       </w:r>
     </w:p>
     <w:p>
@@ -620,7 +620,7 @@
           <w:i w:val="0"/>
           <w:color w:val="202124"/>
         </w:rPr>
-        <w:t>SkillsGate 的主要价值是发现公共 Skills，并在桌面端或 TUI 中管理、编辑和安装到多个 Agent。它解决的是管理与安装问题；本产品优先解决的是解释、策展、信任和社区反馈问题。</w:t>
+        <w:t>SkillsGate 的主要价值是发现公共 Skills，并在桌面端或 TUI 中管理、编辑和安装到多个 Agent。本产品复用其管理式信息架构，但把 Web 首版的“管理”限定为资源整理：收藏、想尝试、已使用和合集；不读取或修改用户电脑。</w:t>
       </w:r>
     </w:p>
     <w:p>
@@ -648,7 +648,7 @@
           <w:color w:val="202124"/>
           <w:sz w:val="22"/>
         </w:rPr>
-        <w:t>现有 SkillsGate 可以作为代码与数据获取方式的参考，但本产品不应被定义成“中文版 SkillsGate”。</w:t>
+        <w:t>保留 SkillsGate 易于管理资源的产品结构，同时增加中文策展、KOL 解释和反馈；本机安装能力继续留在 Electron 或未来的本地助手中。</w:t>
       </w:r>
     </w:p>
     <w:p>
@@ -915,6 +915,30 @@
     </w:p>
     <w:p>
       <w:pPr>
+        <w:spacing w:before="0" w:after="160" w:line="280" w:lineRule="auto"/>
+        <w:numPr>
+          <w:ilvl w:val="0"/>
+          <w:numId w:val="41"/>
+        </w:numPr>
+      </w:pPr>
+      <w:r>
+        <w:rPr>
+          <w:rFonts w:ascii="Arial Unicode MS" w:hAnsi="Arial Unicode MS" w:eastAsia="Arial Unicode MS"/>
+          <w:b/>
+          <w:color w:val="202124"/>
+        </w:rPr>
+        <w:t>状态由用户确认：</w:t>
+      </w:r>
+      <w:r>
+        <w:rPr>
+          <w:rFonts w:ascii="Arial Unicode MS" w:hAnsi="Arial Unicode MS" w:eastAsia="Arial Unicode MS"/>
+          <w:color w:val="202124"/>
+        </w:rPr>
+        <w:t>想尝试、已使用和收藏是资源整理状态，不伪装成自动检测的安装状态。</w:t>
+      </w:r>
+    </w:p>
+    <w:p>
+      <w:pPr>
         <w:pStyle w:val="Heading2"/>
       </w:pPr>
       <w:r>
@@ -1256,7 +1280,7 @@
           <w:rFonts w:ascii="Arial Unicode MS" w:hAnsi="Arial Unicode MS" w:eastAsia="Arial Unicode MS"/>
           <w:color w:val="202124"/>
         </w:rPr>
-        <w:t>收藏、评价、上传案例或提出求测请求。</w:t>
+        <w:t>收藏、标记想尝试或已使用，并匿名反馈结果。</w:t>
       </w:r>
     </w:p>
     <w:p>
@@ -1784,7 +1808,7 @@
           <w:i w:val="0"/>
           <w:color w:val="202124"/>
         </w:rPr>
-        <w:t>首页首先展示主理人的定位、精选合集、最新分享和按任务发现入口。避免以“收录数量”作为主要价值表达。</w:t>
+        <w:t>首页首先展示主理人的定位、精选合集、最新分享，以及通向“发现”和“我的 Skills”的入口。避免以“收录数量”作为主要价值表达。</w:t>
       </w:r>
     </w:p>
     <w:p>
@@ -1884,7 +1908,7 @@
           <w:rFonts w:ascii="Arial Unicode MS" w:hAnsi="Arial Unicode MS" w:eastAsia="Arial Unicode MS"/>
           <w:color w:val="202124"/>
         </w:rPr>
-        <w:t>验证版支持分享和匿名结果反馈；收藏、评论和更新订阅进入 MVP。</w:t>
+        <w:t>验证版支持分享、加入本地资源库和匿名结果反馈；公开评论和更新订阅进入 MVP。</w:t>
       </w:r>
     </w:p>
     <w:p>
@@ -2184,7 +2208,7 @@
           <w:rFonts w:ascii="Arial Unicode MS" w:hAnsi="Arial Unicode MS" w:eastAsia="Arial Unicode MS"/>
           <w:color w:val="202124"/>
         </w:rPr>
-        <w:t>验证版没有账号、收藏、评论、案例上传和公开投稿。</w:t>
+        <w:t>验证版没有账号、公开评论、案例上传和公开投稿；收藏与状态只保存在当前浏览器。</w:t>
       </w:r>
     </w:p>
     <w:p>
@@ -2686,6 +2710,22 @@
           <w:rFonts w:ascii="Arial Unicode MS" w:hAnsi="Arial Unicode MS" w:eastAsia="Arial Unicode MS"/>
           <w:color w:val="202124"/>
         </w:rPr>
+        <w:t>在浏览器中维护收藏、想尝试和已使用等个人资源状态。</w:t>
+      </w:r>
+    </w:p>
+    <w:p>
+      <w:pPr>
+        <w:spacing w:before="0" w:after="160" w:line="280" w:lineRule="auto"/>
+        <w:numPr>
+          <w:ilvl w:val="0"/>
+          <w:numId w:val="41"/>
+        </w:numPr>
+      </w:pPr>
+      <w:r>
+        <w:rPr>
+          <w:rFonts w:ascii="Arial Unicode MS" w:hAnsi="Arial Unicode MS" w:eastAsia="Arial Unicode MS"/>
+          <w:color w:val="202124"/>
+        </w:rPr>
         <w:t>账号、收藏、评价、评论、案例与求测。</w:t>
       </w:r>
     </w:p>
@@ -2858,7 +2898,7 @@
           <w:i w:val="0"/>
           <w:color w:val="202124"/>
         </w:rPr>
-        <w:t>验证版保持四类公开页面，后台内容直接通过 GitHub 或本地数据文件维护：</w:t>
+        <w:t>验证版包含公开内容与本地资源管理两类界面，后台内容直接通过 GitHub 或本地数据文件维护：</w:t>
       </w:r>
     </w:p>
     <w:p>
@@ -2899,6 +2939,54 @@
           <w:b/>
           <w:color w:val="202124"/>
         </w:rPr>
+        <w:t>发现：</w:t>
+      </w:r>
+      <w:r>
+        <w:rPr>
+          <w:rFonts w:ascii="Arial Unicode MS" w:hAnsi="Arial Unicode MS" w:eastAsia="Arial Unicode MS"/>
+          <w:color w:val="202124"/>
+        </w:rPr>
+        <w:t>搜索、分类、中文解释摘要、资源状态操作与组合清单。</w:t>
+      </w:r>
+    </w:p>
+    <w:p>
+      <w:pPr>
+        <w:spacing w:before="0" w:after="160" w:line="280" w:lineRule="auto"/>
+        <w:numPr>
+          <w:ilvl w:val="0"/>
+          <w:numId w:val="41"/>
+        </w:numPr>
+      </w:pPr>
+      <w:r>
+        <w:rPr>
+          <w:rFonts w:ascii="Arial Unicode MS" w:hAnsi="Arial Unicode MS" w:eastAsia="Arial Unicode MS"/>
+          <w:b/>
+          <w:color w:val="202124"/>
+        </w:rPr>
+        <w:t>我的 Skills：</w:t>
+      </w:r>
+      <w:r>
+        <w:rPr>
+          <w:rFonts w:ascii="Arial Unicode MS" w:hAnsi="Arial Unicode MS" w:eastAsia="Arial Unicode MS"/>
+          <w:color w:val="202124"/>
+        </w:rPr>
+        <w:t>手动管理已收录、想尝试、已使用和收藏；明确不代表本机安装状态。</w:t>
+      </w:r>
+    </w:p>
+    <w:p>
+      <w:pPr>
+        <w:spacing w:before="0" w:after="160" w:line="280" w:lineRule="auto"/>
+        <w:numPr>
+          <w:ilvl w:val="0"/>
+          <w:numId w:val="41"/>
+        </w:numPr>
+      </w:pPr>
+      <w:r>
+        <w:rPr>
+          <w:rFonts w:ascii="Arial Unicode MS" w:hAnsi="Arial Unicode MS" w:eastAsia="Arial Unicode MS"/>
+          <w:b/>
+          <w:color w:val="202124"/>
+        </w:rPr>
         <w:t>合集：</w:t>
       </w:r>
       <w:r>
@@ -2986,7 +3074,23 @@
           <w:rFonts w:ascii="Arial Unicode MS" w:hAnsi="Arial Unicode MS" w:eastAsia="Arial Unicode MS"/>
           <w:color w:val="202124"/>
         </w:rPr>
-        <w:t>中文首页和按任务发现。</w:t>
+        <w:t>中文落地页和独立发现页，支持搜索、分类与按任务发现。</w:t>
+      </w:r>
+    </w:p>
+    <w:p>
+      <w:pPr>
+        <w:spacing w:before="0" w:after="160" w:line="280" w:lineRule="auto"/>
+        <w:numPr>
+          <w:ilvl w:val="0"/>
+          <w:numId w:val="41"/>
+        </w:numPr>
+      </w:pPr>
+      <w:r>
+        <w:rPr>
+          <w:rFonts w:ascii="Arial Unicode MS" w:hAnsi="Arial Unicode MS" w:eastAsia="Arial Unicode MS"/>
+          <w:color w:val="202124"/>
+        </w:rPr>
+        <w:t>无账号的本地资源库，支持已收录、想尝试、已使用和收藏。</w:t>
       </w:r>
     </w:p>
     <w:p>
@@ -3264,7 +3368,7 @@
           <w:rFonts w:ascii="Arial Unicode MS" w:hAnsi="Arial Unicode MS" w:eastAsia="Arial Unicode MS"/>
           <w:color w:val="202124"/>
         </w:rPr>
-        <w:t>账号、收藏、站内评论、关注关系和私信。</w:t>
+        <w:t>账号同步、跨设备收藏、站内评论、关注关系和私信。</w:t>
       </w:r>
     </w:p>
     <w:p>
@@ -3596,7 +3700,7 @@
                 <w:color w:val="202124"/>
                 <w:sz w:val="18"/>
               </w:rPr>
-              <w:t>静态内容站；3 个合集；5 个完整 Skill 页；匿名反馈</w:t>
+              <w:t>内容站；发现页；本地资源库；5 个完整 Skill 页；匿名反馈</w:t>
             </w:r>
           </w:p>
         </w:tc>
@@ -3624,7 +3728,7 @@
                 <w:color w:val="202124"/>
                 <w:sz w:val="18"/>
               </w:rPr>
-              <w:t>用户从分享进入并确认一次有效使用</w:t>
+              <w:t>用户收藏或尝试资源并确认一次有效使用</w:t>
             </w:r>
           </w:p>
         </w:tc>
@@ -3710,7 +3814,7 @@
                 <w:color w:val="202124"/>
                 <w:sz w:val="18"/>
               </w:rPr>
-              <w:t>账号与收藏；结构化评价；求测；轻量内容后台</w:t>
+              <w:t>账号同步；结构化评价；求测；轻量内容后台</w:t>
             </w:r>
           </w:p>
         </w:tc>
@@ -4705,7 +4809,7 @@
           <w:rFonts w:ascii="Arial Unicode MS" w:hAnsi="Arial Unicode MS" w:eastAsia="Arial Unicode MS"/>
           <w:color w:val="202124"/>
         </w:rPr>
-        <w:t>落地无账号的静态内容站，接入“开始使用”和匿名一键结果反馈。</w:t>
+        <w:t>落地无账号的 Web 资源站，包含发现页、“我的 Skills”本地资源库，以及匿名一键结果反馈。</w:t>
       </w:r>
     </w:p>
     <w:p>
@@ -4737,7 +4841,7 @@
           <w:rFonts w:ascii="Arial Unicode MS" w:hAnsi="Arial Unicode MS" w:eastAsia="Arial Unicode MS"/>
           <w:color w:val="202124"/>
         </w:rPr>
-        <w:t>用同一主题比较置顶帖与网站页面的转化和回访，再决定是否建设账号、收藏与社区功能。</w:t>
+        <w:t>用同一主题比较置顶帖与网站页面的收藏、尝试、反馈和回访，再决定是否建设账号同步与公开社区。</w:t>
       </w:r>
     </w:p>
     <w:p>

</xml_diff>